<commit_message>
chore(template): atualizar modelo oficial de proposta DOCX com tags obsorca e obs
</commit_message>
<xml_diff>
--- a/public/proposal-template-default.docx
+++ b/public/proposal-template-default.docx
@@ -71,7 +71,6 @@
         </w:rPr>
         <w:t>ORÇAMENTO Nº {{</w:t>
       </w:r>
-      <w:proofErr w:type="spellStart"/>
       <w:r>
         <w:rPr>
           <w:color w:val="17365D" w:themeColor="text2" w:themeShade="BF"/>
@@ -84,7 +83,6 @@
         </w:rPr>
         <w:t>ta</w:t>
       </w:r>
-      <w:proofErr w:type="spellEnd"/>
       <w:r>
         <w:rPr>
           <w:color w:val="17365D" w:themeColor="text2" w:themeShade="BF"/>
@@ -94,22 +92,10 @@
     </w:p>
     <w:p>
       <w:r>
-        <w:t xml:space="preserve">Aos </w:t>
-      </w:r>
-      <w:proofErr w:type="spellStart"/>
-      <w:r>
-        <w:t>cuidados</w:t>
-      </w:r>
-      <w:proofErr w:type="spellEnd"/>
-      <w:r>
-        <w:t xml:space="preserve"> de: </w:t>
+        <w:t xml:space="preserve">Aos cuidados de: </w:t>
       </w:r>
       <w:r>
-        <w:t>{{</w:t>
-      </w:r>
-      <w:proofErr w:type="spellStart"/>
-      <w:r>
-        <w:t>nome</w:t>
+        <w:t>{{nome</w:t>
       </w:r>
       <w:r>
         <w:t>do</w:t>
@@ -120,7 +106,6 @@
       <w:r>
         <w:t>ente</w:t>
       </w:r>
-      <w:proofErr w:type="spellEnd"/>
       <w:r>
         <w:t>}}</w:t>
       </w:r>
@@ -132,13 +117,31 @@
       <w:r>
         <w:t>{{</w:t>
       </w:r>
-      <w:proofErr w:type="spellStart"/>
       <w:r>
         <w:t>razaosocial</w:t>
       </w:r>
-      <w:proofErr w:type="spellEnd"/>
       <w:r>
         <w:t>}}</w:t>
+      </w:r>
+    </w:p>
+    <w:p>
+      <w:pPr>
+        <w:pStyle w:val="Ttulo2"/>
+        <w:rPr>
+          <w:color w:val="17365D" w:themeColor="text2" w:themeShade="BF"/>
+        </w:rPr>
+      </w:pPr>
+      <w:r>
+        <w:rPr>
+          <w:color w:val="17365D" w:themeColor="text2" w:themeShade="BF"/>
+        </w:rPr>
+        <w:t>Observações do orçamento</w:t>
+      </w:r>
+    </w:p>
+    <w:p>
+      <w:r>
+        <w:br/>
+        <w:t>{{obsorca}}</w:t>
       </w:r>
     </w:p>
     <w:p>
@@ -159,19 +162,20 @@
       <w:tblPr>
         <w:tblStyle w:val="Tabelacomgrade"/>
         <w:tblW w:w="0" w:type="auto"/>
+        <w:tblLayout w:type="fixed"/>
         <w:tblLook w:val="04A0" w:firstRow="1" w:lastRow="0" w:firstColumn="1" w:lastColumn="0" w:noHBand="0" w:noVBand="1"/>
       </w:tblPr>
       <w:tblGrid>
-        <w:gridCol w:w="2623"/>
-        <w:gridCol w:w="2116"/>
-        <w:gridCol w:w="1181"/>
-        <w:gridCol w:w="1289"/>
-        <w:gridCol w:w="1647"/>
+        <w:gridCol w:w="1809"/>
+        <w:gridCol w:w="3287"/>
+        <w:gridCol w:w="1097"/>
+        <w:gridCol w:w="1043"/>
+        <w:gridCol w:w="1620"/>
       </w:tblGrid>
       <w:tr>
         <w:tc>
           <w:tcPr>
-            <w:tcW w:w="1728" w:type="dxa"/>
+            <w:tcW w:w="1809" w:type="dxa"/>
           </w:tcPr>
           <w:p>
             <w:r>
@@ -181,7 +185,7 @@
         </w:tc>
         <w:tc>
           <w:tcPr>
-            <w:tcW w:w="1728" w:type="dxa"/>
+            <w:tcW w:w="3287" w:type="dxa"/>
           </w:tcPr>
           <w:p>
             <w:r>
@@ -191,7 +195,7 @@
         </w:tc>
         <w:tc>
           <w:tcPr>
-            <w:tcW w:w="1728" w:type="dxa"/>
+            <w:tcW w:w="1097" w:type="dxa"/>
           </w:tcPr>
           <w:p>
             <w:r>
@@ -201,7 +205,7 @@
         </w:tc>
         <w:tc>
           <w:tcPr>
-            <w:tcW w:w="1728" w:type="dxa"/>
+            <w:tcW w:w="1043" w:type="dxa"/>
           </w:tcPr>
           <w:p>
             <w:r>
@@ -211,7 +215,7 @@
         </w:tc>
         <w:tc>
           <w:tcPr>
-            <w:tcW w:w="1728" w:type="dxa"/>
+            <w:tcW w:w="1620" w:type="dxa"/>
           </w:tcPr>
           <w:p>
             <w:r>
@@ -223,7 +227,7 @@
       <w:tr>
         <w:tc>
           <w:tcPr>
-            <w:tcW w:w="1728" w:type="dxa"/>
+            <w:tcW w:w="1809" w:type="dxa"/>
             <w:vAlign w:val="center"/>
           </w:tcPr>
           <w:p>
@@ -231,21 +235,7 @@
               <w:rPr>
                 <w:rFonts w:asciiTheme="majorHAnsi" w:hAnsiTheme="majorHAnsi"/>
               </w:rPr>
-              <w:t>{{#items</w:t>
-            </w:r>
-            <w:proofErr w:type="gramStart"/>
-            <w:r>
-              <w:rPr>
-                <w:rFonts w:asciiTheme="majorHAnsi" w:hAnsiTheme="majorHAnsi"/>
-              </w:rPr>
-              <w:t>}}{</w:t>
-            </w:r>
-            <w:proofErr w:type="gramEnd"/>
-            <w:r>
-              <w:rPr>
-                <w:rFonts w:asciiTheme="majorHAnsi" w:hAnsiTheme="majorHAnsi"/>
-              </w:rPr>
-              <w:t>{cod</w:t>
+              <w:t>{{#items}}{{cod</w:t>
             </w:r>
             <w:r>
               <w:rPr>
@@ -263,20 +253,15 @@
         </w:tc>
         <w:tc>
           <w:tcPr>
-            <w:tcW w:w="1728" w:type="dxa"/>
+            <w:tcW w:w="3287" w:type="dxa"/>
           </w:tcPr>
           <w:p>
             <w:r>
-              <w:t>{{</w:t>
-            </w:r>
-            <w:proofErr w:type="spellStart"/>
-            <w:r>
-              <w:t>desc</w:t>
+              <w:t>{{desc</w:t>
             </w:r>
             <w:r>
               <w:t>ricaodoitem</w:t>
             </w:r>
-            <w:proofErr w:type="spellEnd"/>
             <w:r>
               <w:t>}}</w:t>
             </w:r>
@@ -284,7 +269,7 @@
         </w:tc>
         <w:tc>
           <w:tcPr>
-            <w:tcW w:w="1728" w:type="dxa"/>
+            <w:tcW w:w="1097" w:type="dxa"/>
           </w:tcPr>
           <w:p>
             <w:r>
@@ -294,7 +279,7 @@
         </w:tc>
         <w:tc>
           <w:tcPr>
-            <w:tcW w:w="1728" w:type="dxa"/>
+            <w:tcW w:w="1043" w:type="dxa"/>
           </w:tcPr>
           <w:p>
             <w:r>
@@ -304,7 +289,7 @@
         </w:tc>
         <w:tc>
           <w:tcPr>
-            <w:tcW w:w="1728" w:type="dxa"/>
+            <w:tcW w:w="1620" w:type="dxa"/>
             <w:vAlign w:val="center"/>
           </w:tcPr>
           <w:p>
@@ -314,35 +299,7 @@
                 <w:sz w:val="21"/>
                 <w:szCs w:val="21"/>
               </w:rPr>
-              <w:t>{{</w:t>
-            </w:r>
-            <w:proofErr w:type="spellStart"/>
-            <w:r>
-              <w:rPr>
-                <w:rFonts w:asciiTheme="majorHAnsi" w:hAnsiTheme="majorHAnsi"/>
-                <w:sz w:val="21"/>
-                <w:szCs w:val="21"/>
-              </w:rPr>
-              <w:t>obs</w:t>
-            </w:r>
-            <w:proofErr w:type="spellEnd"/>
-            <w:proofErr w:type="gramStart"/>
-            <w:r>
-              <w:rPr>
-                <w:rFonts w:asciiTheme="majorHAnsi" w:hAnsiTheme="majorHAnsi"/>
-                <w:sz w:val="21"/>
-                <w:szCs w:val="21"/>
-              </w:rPr>
-              <w:t>}}{</w:t>
-            </w:r>
-            <w:proofErr w:type="gramEnd"/>
-            <w:r>
-              <w:rPr>
-                <w:rFonts w:asciiTheme="majorHAnsi" w:hAnsiTheme="majorHAnsi"/>
-                <w:sz w:val="21"/>
-                <w:szCs w:val="21"/>
-              </w:rPr>
-              <w:t>{/items}}</w:t>
+              <w:t>{{obs}}{{/items}}</w:t>
             </w:r>
           </w:p>
         </w:tc>
@@ -370,214 +327,22 @@
     </w:p>
     <w:p>
       <w:r>
-        <w:t xml:space="preserve">• </w:t>
-      </w:r>
-      <w:proofErr w:type="spellStart"/>
-      <w:r>
-        <w:t>Verificar</w:t>
-      </w:r>
-      <w:proofErr w:type="spellEnd"/>
-      <w:r>
-        <w:t xml:space="preserve"> a </w:t>
-      </w:r>
-      <w:proofErr w:type="spellStart"/>
-      <w:r>
-        <w:t>disponibilidade</w:t>
-      </w:r>
-      <w:proofErr w:type="spellEnd"/>
-      <w:r>
-        <w:t xml:space="preserve"> de </w:t>
-      </w:r>
-      <w:proofErr w:type="spellStart"/>
-      <w:r>
-        <w:t>datas</w:t>
-      </w:r>
-      <w:proofErr w:type="spellEnd"/>
-      <w:r>
-        <w:t xml:space="preserve"> para </w:t>
-      </w:r>
-      <w:proofErr w:type="spellStart"/>
-      <w:r>
-        <w:t>realização</w:t>
-      </w:r>
-      <w:proofErr w:type="spellEnd"/>
-      <w:r>
-        <w:t xml:space="preserve"> do </w:t>
-      </w:r>
-      <w:proofErr w:type="spellStart"/>
-      <w:r>
-        <w:t>serviço</w:t>
-      </w:r>
-      <w:proofErr w:type="spellEnd"/>
-      <w:r>
-        <w:t>.</w:t>
+        <w:t>• Verificar a disponibilidade de datas para realização do serviço.</w:t>
       </w:r>
     </w:p>
     <w:p>
       <w:r>
-        <w:t xml:space="preserve">• </w:t>
-      </w:r>
-      <w:proofErr w:type="spellStart"/>
-      <w:r>
-        <w:t>Os</w:t>
-      </w:r>
-      <w:proofErr w:type="spellEnd"/>
-      <w:r>
-        <w:t xml:space="preserve"> </w:t>
-      </w:r>
-      <w:proofErr w:type="spellStart"/>
-      <w:r>
-        <w:t>ensaios</w:t>
-      </w:r>
-      <w:proofErr w:type="spellEnd"/>
-      <w:r>
-        <w:t xml:space="preserve"> de </w:t>
-      </w:r>
-      <w:proofErr w:type="spellStart"/>
-      <w:r>
-        <w:t>laboratório</w:t>
-      </w:r>
-      <w:proofErr w:type="spellEnd"/>
-      <w:r>
-        <w:t xml:space="preserve"> {{</w:t>
-      </w:r>
-      <w:proofErr w:type="spellStart"/>
-      <w:r>
-        <w:t>ensaiolab</w:t>
-      </w:r>
-      <w:proofErr w:type="spellEnd"/>
-      <w:r>
-        <w:t xml:space="preserve">}} </w:t>
-      </w:r>
-      <w:proofErr w:type="spellStart"/>
-      <w:r>
-        <w:t>estão</w:t>
-      </w:r>
-      <w:proofErr w:type="spellEnd"/>
-      <w:r>
-        <w:t xml:space="preserve"> </w:t>
-      </w:r>
-      <w:proofErr w:type="spellStart"/>
-      <w:r>
-        <w:t>inclusos</w:t>
-      </w:r>
-      <w:proofErr w:type="spellEnd"/>
-      <w:r>
-        <w:t xml:space="preserve"> no valor </w:t>
-      </w:r>
-      <w:proofErr w:type="spellStart"/>
-      <w:r>
-        <w:t>acima</w:t>
-      </w:r>
-      <w:proofErr w:type="spellEnd"/>
-      <w:r>
-        <w:t>.</w:t>
+        <w:t>• Os ensaios de laboratório {{ensaiolab}} estão inclusos no valor acima.</w:t>
       </w:r>
     </w:p>
     <w:p>
       <w:r>
-        <w:t xml:space="preserve">• </w:t>
-      </w:r>
-      <w:proofErr w:type="spellStart"/>
-      <w:r>
-        <w:t>Após</w:t>
-      </w:r>
-      <w:proofErr w:type="spellEnd"/>
-      <w:r>
-        <w:t xml:space="preserve"> o </w:t>
-      </w:r>
-      <w:proofErr w:type="spellStart"/>
-      <w:r>
-        <w:t>aceite</w:t>
-      </w:r>
-      <w:proofErr w:type="spellEnd"/>
-      <w:r>
-        <w:t xml:space="preserve"> do </w:t>
-      </w:r>
-      <w:proofErr w:type="spellStart"/>
-      <w:r>
-        <w:t>orçamento</w:t>
-      </w:r>
-      <w:proofErr w:type="spellEnd"/>
-      <w:r>
-        <w:t xml:space="preserve">, </w:t>
-      </w:r>
-      <w:proofErr w:type="spellStart"/>
-      <w:r>
-        <w:t>enviar</w:t>
-      </w:r>
-      <w:proofErr w:type="spellEnd"/>
-      <w:r>
-        <w:t xml:space="preserve"> o </w:t>
-      </w:r>
-      <w:proofErr w:type="spellStart"/>
-      <w:r>
-        <w:t>pedido</w:t>
-      </w:r>
-      <w:proofErr w:type="spellEnd"/>
-      <w:r>
-        <w:t xml:space="preserve"> de </w:t>
-      </w:r>
-      <w:proofErr w:type="spellStart"/>
-      <w:r>
-        <w:t>compra</w:t>
-      </w:r>
-      <w:proofErr w:type="spellEnd"/>
-      <w:r>
-        <w:t xml:space="preserve"> para </w:t>
-      </w:r>
-      <w:proofErr w:type="spellStart"/>
-      <w:r>
-        <w:t>início</w:t>
-      </w:r>
-      <w:proofErr w:type="spellEnd"/>
-      <w:r>
-        <w:t xml:space="preserve"> dos </w:t>
-      </w:r>
-      <w:proofErr w:type="spellStart"/>
-      <w:r>
-        <w:t>processos</w:t>
-      </w:r>
-      <w:proofErr w:type="spellEnd"/>
-      <w:r>
-        <w:t>.</w:t>
+        <w:t>• Após o aceite do orçamento, enviar o pedido de compra para início dos processos.</w:t>
       </w:r>
     </w:p>
     <w:p>
       <w:r>
-        <w:t xml:space="preserve">• Forma de </w:t>
-      </w:r>
-      <w:proofErr w:type="spellStart"/>
-      <w:r>
-        <w:t>pagamento</w:t>
-      </w:r>
-      <w:proofErr w:type="spellEnd"/>
-      <w:r>
-        <w:t xml:space="preserve">: 15 </w:t>
-      </w:r>
-      <w:proofErr w:type="spellStart"/>
-      <w:r>
-        <w:t>dias</w:t>
-      </w:r>
-      <w:proofErr w:type="spellEnd"/>
-      <w:r>
-        <w:t xml:space="preserve"> </w:t>
-      </w:r>
-      <w:proofErr w:type="spellStart"/>
-      <w:r>
-        <w:t>após</w:t>
-      </w:r>
-      <w:proofErr w:type="spellEnd"/>
-      <w:r>
-        <w:t xml:space="preserve"> </w:t>
-      </w:r>
-      <w:proofErr w:type="gramStart"/>
-      <w:r>
-        <w:t>a</w:t>
-      </w:r>
-      <w:proofErr w:type="gramEnd"/>
-      <w:r>
-        <w:t xml:space="preserve"> emissão da nota fiscal e boleto.</w:t>
+        <w:t>• Forma de pagamento: 15 dias após a emissão da nota fiscal e boleto.</w:t>
       </w:r>
     </w:p>
     <w:p/>
@@ -595,13 +360,8 @@
         <w:br/>
       </w:r>
       <w:r>
-        <w:t xml:space="preserve">Departamento de </w:t>
+        <w:t>Departamento de Orçamentos</w:t>
       </w:r>
-      <w:proofErr w:type="spellStart"/>
-      <w:r>
-        <w:t>Orçamentos</w:t>
-      </w:r>
-      <w:proofErr w:type="spellEnd"/>
       <w:r>
         <w:br/>
       </w:r>
@@ -669,12 +429,11 @@
         <w:szCs w:val="20"/>
         <w:lang w:eastAsia="pt-BR"/>
       </w:rPr>
-      <w:t xml:space="preserve">ORBITAL </w:t>
+      <w:t>ORBITAL MAIS  TECNOLOGIA EM SOLDAGEM E INSPE</w:t>
     </w:r>
-    <w:proofErr w:type="gramStart"/>
     <w:r>
       <w:rPr>
-        <w:rFonts w:ascii="Baskerville" w:eastAsia="Times New Roman" w:hAnsi="Baskerville" w:cs="Arial Hebrew"/>
+        <w:rFonts w:ascii="Baskerville" w:eastAsia="Times New Roman" w:hAnsi="Baskerville" w:cs="Cambria"/>
         <w:b/>
         <w:bCs/>
         <w:color w:val="000000"/>
@@ -682,9 +441,8 @@
         <w:szCs w:val="20"/>
         <w:lang w:eastAsia="pt-BR"/>
       </w:rPr>
-      <w:t>MAIS  TECNOLOGIA</w:t>
+      <w:t>ÇÃ</w:t>
     </w:r>
-    <w:proofErr w:type="gramEnd"/>
     <w:r>
       <w:rPr>
         <w:rFonts w:ascii="Baskerville" w:eastAsia="Times New Roman" w:hAnsi="Baskerville" w:cs="Arial Hebrew"/>
@@ -695,11 +453,11 @@
         <w:szCs w:val="20"/>
         <w:lang w:eastAsia="pt-BR"/>
       </w:rPr>
-      <w:t xml:space="preserve"> EM SOLDAGEM E INSPE</w:t>
+      <w:t>O DE END</w:t>
     </w:r>
     <w:r>
       <w:rPr>
-        <w:rFonts w:ascii="Baskerville" w:eastAsia="Times New Roman" w:hAnsi="Baskerville" w:cs="Cambria"/>
+        <w:rFonts w:ascii="Baskerville" w:eastAsia="Times New Roman" w:hAnsi="Baskerville" w:cs="Arial Hebrew"/>
         <w:b/>
         <w:bCs/>
         <w:color w:val="000000"/>
@@ -707,34 +465,9 @@
         <w:szCs w:val="20"/>
         <w:lang w:eastAsia="pt-BR"/>
       </w:rPr>
-      <w:t>ÇÃ</w:t>
-    </w:r>
-    <w:r>
-      <w:rPr>
-        <w:rFonts w:ascii="Baskerville" w:eastAsia="Times New Roman" w:hAnsi="Baskerville" w:cs="Arial Hebrew"/>
-        <w:b/>
-        <w:bCs/>
-        <w:color w:val="000000"/>
-        <w:sz w:val="20"/>
-        <w:szCs w:val="20"/>
-        <w:lang w:eastAsia="pt-BR"/>
-      </w:rPr>
-      <w:t>O DE END</w:t>
-    </w:r>
-    <w:r>
-      <w:rPr>
-        <w:rFonts w:ascii="Baskerville" w:eastAsia="Times New Roman" w:hAnsi="Baskerville" w:cs="Arial Hebrew"/>
-        <w:b/>
-        <w:bCs/>
-        <w:color w:val="000000"/>
-        <w:sz w:val="20"/>
-        <w:szCs w:val="20"/>
-        <w:lang w:eastAsia="pt-BR"/>
-      </w:rPr>
       <w:br/>
     </w:r>
     <w:hyperlink r:id="rId1">
-      <w:proofErr w:type="spellStart"/>
       <w:r>
         <w:rPr>
           <w:rFonts w:ascii="Baskerville" w:hAnsi="Baskerville" w:cs="Arial Hebrew"/>
@@ -768,7 +501,6 @@
         </w:rPr>
         <w:t>o</w:t>
       </w:r>
-      <w:proofErr w:type="spellEnd"/>
     </w:hyperlink>
     <w:r>
       <w:rPr>
@@ -800,23 +532,13 @@
       </w:rPr>
       <w:t xml:space="preserve"> </w:t>
     </w:r>
-    <w:proofErr w:type="spellStart"/>
     <w:r>
       <w:rPr>
         <w:rFonts w:ascii="Baskerville" w:hAnsi="Baskerville" w:cs="Arial Hebrew"/>
         <w:sz w:val="20"/>
         <w:szCs w:val="20"/>
       </w:rPr>
-      <w:t>Estr</w:t>
-    </w:r>
-    <w:proofErr w:type="spellEnd"/>
-    <w:r>
-      <w:rPr>
-        <w:rFonts w:ascii="Baskerville" w:hAnsi="Baskerville" w:cs="Arial Hebrew"/>
-        <w:sz w:val="20"/>
-        <w:szCs w:val="20"/>
-      </w:rPr>
-      <w:t>.</w:t>
+      <w:t>Estr.</w:t>
     </w:r>
     <w:r>
       <w:rPr>
@@ -844,23 +566,13 @@
       </w:rPr>
       <w:t xml:space="preserve"> </w:t>
     </w:r>
-    <w:proofErr w:type="spellStart"/>
     <w:r>
       <w:rPr>
         <w:rFonts w:ascii="Baskerville" w:hAnsi="Baskerville" w:cs="Arial Hebrew"/>
         <w:sz w:val="20"/>
         <w:szCs w:val="20"/>
       </w:rPr>
-      <w:t>Pereiras</w:t>
-    </w:r>
-    <w:proofErr w:type="spellEnd"/>
-    <w:r>
-      <w:rPr>
-        <w:rFonts w:ascii="Baskerville" w:hAnsi="Baskerville" w:cs="Arial Hebrew"/>
-        <w:sz w:val="20"/>
-        <w:szCs w:val="20"/>
-      </w:rPr>
-      <w:t>,</w:t>
+      <w:t>Pereiras,</w:t>
     </w:r>
     <w:r>
       <w:rPr>
@@ -1632,7 +1344,7 @@
   <w:style w:type="paragraph" w:default="1" w:styleId="Normal">
     <w:name w:val="Normal"/>
     <w:qFormat/>
-    <w:rsid w:val="00FC693F"/>
+    <w:rsid w:val="00E83FA6"/>
   </w:style>
   <w:style w:type="paragraph" w:styleId="Ttulo1">
     <w:name w:val="heading 1"/>

</xml_diff>